<commit_message>
docs(standards): drop the feed-it-to-a-tool block from the human-review page
That block told the reader most of the document was a base for a coding tool to
apply rather than prose to work through. On this page that is simply false: it
is written for a CISO or an engineering manager to read, and it contradicted its
own first sentence.

Replaced with a plain 'Take a copy' line. Both file types keep their links --
markdown and Word -- plus the pointer to the full download table, so nothing a
reader might want is lost.

The block stays on the four standards where it is true. The CISO summary keeps
its variant, which already stated the distinction rather than claiming the
framing for itself.

REVIEW-DEPTH.docx regenerated. Verified: check-ascii clean, 35 tests pass.
</commit_message>
<xml_diff>
--- a/docs/standards/word/REVIEW-DEPTH.docx
+++ b/docs/standards/word/REVIEW-DEPTH.docx
@@ -72,33 +72,7 @@
           <w:b/>
           <w:bCs/>
         </w:rPr>
-        <w:t xml:space="preserve">Meant to be worked with, not read straight through.</w:t>
-      </w:r>
-      <w:r>
-        <w:t xml:space="preserve"> </w:t>
-      </w:r>
-      <w:r>
-        <w:t xml:space="preserve">Most of this standard is a base for</w:t>
-      </w:r>
-      <w:r>
-        <w:t xml:space="preserve"> </w:t>
-      </w:r>
-      <w:r>
-        <w:t xml:space="preserve">Claude Code, or another AI-assisted coding tool, to apply to your code, rather than</w:t>
-      </w:r>
-      <w:r>
-        <w:t xml:space="preserve"> </w:t>
-      </w:r>
-      <w:r>
-        <w:t xml:space="preserve">prose to work through by hand.</w:t>
-      </w:r>
-    </w:p>
-    <w:p>
-      <w:pPr>
-        <w:pStyle w:val="BlockText"/>
-      </w:pPr>
-      <w:r>
-        <w:t xml:space="preserve">The fastest way in: give the tool the</w:t>
+        <w:t xml:space="preserve">Take a copy:</w:t>
       </w:r>
       <w:r>
         <w:t xml:space="preserve"> </w:t>
@@ -112,46 +86,10 @@
         </w:r>
       </w:hyperlink>
       <w:r>
-        <w:t xml:space="preserve">,</w:t>
-      </w:r>
-      <w:r>
-        <w:t xml:space="preserve"> </w:t>
-      </w:r>
-      <w:r>
-        <w:t xml:space="preserve">ask it to</w:t>
-      </w:r>
-      <w:r>
-        <w:t xml:space="preserve"> </w:t>
-      </w:r>
-      <w:r>
-        <w:rPr>
-          <w:b/>
-          <w:bCs/>
-        </w:rPr>
-        <w:t xml:space="preserve">summarize the document against your repository</w:t>
-      </w:r>
-      <w:r>
-        <w:t xml:space="preserve">, and then ask it questions. What here</w:t>
-      </w:r>
-      <w:r>
-        <w:t xml:space="preserve"> </w:t>
-      </w:r>
-      <w:r>
-        <w:t xml:space="preserve">already holds? What would have to change? What would each gap cost? That conversation is worth more</w:t>
-      </w:r>
-      <w:r>
-        <w:t xml:space="preserve"> </w:t>
-      </w:r>
-      <w:r>
-        <w:t xml:space="preserve">than reading top to bottom, because the answers are about your code rather than about the document.</w:t>
-      </w:r>
-    </w:p>
-    <w:p>
-      <w:pPr>
-        <w:pStyle w:val="BlockText"/>
-      </w:pPr>
-      <w:r>
-        <w:t xml:space="preserve">Reading or circulating instead?</w:t>
+        <w:t xml:space="preserve"> </w:t>
+      </w:r>
+      <w:r>
+        <w:t xml:space="preserve">or</w:t>
       </w:r>
       <w:r>
         <w:t xml:space="preserve"> </w:t>

</xml_diff>

<commit_message>
docs(standards): name the code in the title -- AI-generated
"How much of this code does a human have to read?" only says what it means to
somebody already reading the page. In a nav list, a search result or a link it
says nothing, and this is a document people will arrive at from outside.

Now "How much of AI-generated code does a human have to read?"

The nav title moved with it -- it carries the H1 verbatim by convention, and the
Word-copy pin compares headings against the generated .docx, so a title changed
in one place and not the others fails the suite. REVIEW-DEPTH.docx regenerated.

Verified: check-ascii clean, 35 tests pass.
</commit_message>
<xml_diff>
--- a/docs/standards/word/REVIEW-DEPTH.docx
+++ b/docs/standards/word/REVIEW-DEPTH.docx
@@ -28,13 +28,13 @@
         </w:p>
       </w:sdtContent>
     </w:sdt>
-    <w:bookmarkStart w:id="26" w:name="Xb4b1ec7368c70e118c0b4ee1ac6a10a80365756"/>
+    <w:bookmarkStart w:id="26" w:name="Xa506ae5d9b106408f7ea42855285c75741e8a3b"/>
     <w:p>
       <w:pPr>
         <w:pStyle w:val="Heading1"/>
       </w:pPr>
       <w:r>
-        <w:t xml:space="preserve">How much of this code does a human have to read?</w:t>
+        <w:t xml:space="preserve">How much of AI-generated code does a human have to read?</w:t>
       </w:r>
     </w:p>
     <w:p>

</xml_diff>

<commit_message>
docs(standards): the cost bullet led with what you do not get
"It shifts effort rather than removing it" opens a costs-and-limits list by
telling the reader the thing does not save them anything. That is honest but it
buries the actual point, which is where the effort goes.

Now: "It focuses your effort rather than reducing it." The cost is still stated
plainly -- deciding the tier takes judgment at the start of each change, and that
judgment is not free -- and the return is named: a deep read that lands only
where it earns its cost, instead of attention spread evenly over code that does
not need it.

REVIEW-DEPTH.docx regenerated. Verified: check-ascii clean, 35 tests pass.
</commit_message>
<xml_diff>
--- a/docs/standards/word/REVIEW-DEPTH.docx
+++ b/docs/standards/word/REVIEW-DEPTH.docx
@@ -296,19 +296,25 @@
           <w:b/>
           <w:bCs/>
         </w:rPr>
-        <w:t xml:space="preserve">It shifts effort rather than removing it.</w:t>
-      </w:r>
-      <w:r>
-        <w:t xml:space="preserve"> </w:t>
-      </w:r>
-      <w:r>
-        <w:t xml:space="preserve">Deciding the tier takes judgment at the start of</w:t>
-      </w:r>
-      <w:r>
-        <w:t xml:space="preserve"> </w:t>
-      </w:r>
-      <w:r>
-        <w:t xml:space="preserve">each change. The saving is that the deep read lands only where it earns its cost.</w:t>
+        <w:t xml:space="preserve">It focuses your effort rather than reducing it.</w:t>
+      </w:r>
+      <w:r>
+        <w:t xml:space="preserve"> </w:t>
+      </w:r>
+      <w:r>
+        <w:t xml:space="preserve">Deciding the tier takes judgment at the start</w:t>
+      </w:r>
+      <w:r>
+        <w:t xml:space="preserve"> </w:t>
+      </w:r>
+      <w:r>
+        <w:t xml:space="preserve">of each change, and that judgment is not free. What you get back is a deep read that lands only</w:t>
+      </w:r>
+      <w:r>
+        <w:t xml:space="preserve"> </w:t>
+      </w:r>
+      <w:r>
+        <w:t xml:space="preserve">where it earns its cost, instead of attention spread evenly over code that does not need it.</w:t>
       </w:r>
     </w:p>
     <w:p>

</xml_diff>